<commit_message>
fix: rodapé full-width via XML direto em twips — corrige desalinhamento esquerdo
</commit_message>
<xml_diff>
--- a/Modelos jus/AGRAVO_INSTRUMENTO.docx
+++ b/Modelos jus/AGRAVO_INSTRUMENTO.docx
@@ -7,29 +7,28 @@
         <w:spacing w:before="0" w:after="0"/>
       </w:pPr>
       <w:r>
-        <w:rPr/>
         <w:drawing>
           <wp:anchor distT="0" distB="0" distL="0" distR="0" simplePos="0" relativeHeight="251659264" behindDoc="0" locked="0" layoutInCell="1" allowOverlap="1">
             <wp:simplePos x="0" y="0"/>
             <wp:positionH relativeFrom="margin">
-              <wp:posOffset>-1007999</wp:posOffset>
+              <wp:posOffset>-575650</wp:posOffset>
             </wp:positionH>
-            <wp:positionV relativeFrom="margin">
-              <wp:posOffset>1440000</wp:posOffset>
+            <wp:positionV relativeFrom="topMargin">
+              <wp:posOffset>1260000</wp:posOffset>
             </wp:positionV>
-            <wp:extent cx="432000" cy="6480000"/>
+            <wp:extent cx="360000" cy="7200000"/>
             <wp:effectExtent l="0" t="0" r="0" b="0"/>
             <wp:wrapNone/>
-            <wp:docPr id="1" name="SidebarText"/>
+            <wp:docPr id="11" name="SidebarText"/>
             <wp:cNvGraphicFramePr/>
             <a:graphic>
               <a:graphicData uri="http://schemas.microsoft.com/office/word/2010/wordprocessingShape">
                 <wps:wsp>
                   <wps:cNvSpPr txBx="1"/>
                   <wps:spPr>
-                    <a:xfrm rot="16200000">
+                    <a:xfrm>
                       <a:off x="0" y="0"/>
-                      <a:ext cx="6480000" cy="432000"/>
+                      <a:ext cx="360000" cy="7200000"/>
                     </a:xfrm>
                     <a:prstGeom prst="rect">
                       <a:avLst/>
@@ -48,9 +47,10 @@
                         </w:pPr>
                         <w:r>
                           <w:rPr>
-                            <w:color w:val="0D2340"/>
-                            <w:sz w:val="18"/>
-                            <w:szCs w:val="18"/>
+                            <w:rFonts w:ascii="Arial" w:hAnsi="Arial"/>
+                            <w:color w:val="173A63"/>
+                            <w:sz w:val="14"/>
+                            <w:szCs w:val="14"/>
                             <w:spacing w:val="120"/>
                           </w:rPr>
                           <w:t>AGRAVO DE INSTRUMENTO</w:t>
@@ -58,7 +58,7 @@
                       </w:p>
                     </w:txbxContent>
                   </wps:txbx>
-                  <wps:bodyPr rot="0" vert="horz" wrap="square" lIns="0" tIns="0" rIns="0" bIns="0" anchor="ctr"/>
+                  <wps:bodyPr rot="0" vert="vert270" wrap="square" lIns="72000" tIns="72000" rIns="72000" bIns="72000" anchor="ctr" anchorCtr="0"/>
                 </wps:wsp>
               </a:graphicData>
             </a:graphic>
@@ -66,12 +66,491 @@
         </w:drawing>
       </w:r>
     </w:p>
+    <w:p xmlns:a="http://schemas.openxmlformats.org/drawingml/2006/main">
+      <w:pPr>
+        <w:spacing w:before="0" w:after="0"/>
+      </w:pPr>
+      <w:r>
+        <w:drawing>
+          <wp:anchor distT="0" distB="0" distL="0" distR="0" simplePos="0" relativeHeight="251659264" behindDoc="1" locked="0" layoutInCell="1" allowOverlap="1">
+            <wp:simplePos x="0" y="0"/>
+            <wp:positionH relativeFrom="margin">
+              <wp:posOffset>-648000</wp:posOffset>
+            </wp:positionH>
+            <wp:positionV relativeFrom="topMargin">
+              <wp:posOffset>1260000</wp:posOffset>
+            </wp:positionV>
+            <wp:extent cx="6350" cy="7200000"/>
+            <wp:effectExtent l="0" t="0" r="0" b="0"/>
+            <wp:wrapNone/>
+            <wp:docPr id="10" name="GoldLine"/>
+            <wp:cNvGraphicFramePr/>
+            <a:graphic>
+              <a:graphicData uri="http://schemas.microsoft.com/office/word/2010/wordprocessingShape">
+                <wps:wsp>
+                  <wps:cNvSpPr txBx="0"/>
+                  <wps:spPr>
+                    <a:xfrm>
+                      <a:off x="0" y="0"/>
+                      <a:ext cx="6350" cy="7200000"/>
+                    </a:xfrm>
+                    <a:prstGeom prst="rect">
+                      <a:avLst/>
+                    </a:prstGeom>
+                    <a:solidFill>
+                      <a:srgbClr val="B69A54"/>
+                    </a:solidFill>
+                    <a:ln>
+                      <a:noFill/>
+                    </a:ln>
+                  </wps:spPr>
+                  <wps:bodyPr/>
+                </wps:wsp>
+              </a:graphicData>
+            </a:graphic>
+          </wp:anchor>
+        </w:drawing>
+      </w:r>
+    </w:p>
+    <w:p>
+      <w:pPr>
+        <w:pStyle w:val="AEEndereçamento"/>
+      </w:pPr>
+      <w:r>
+        <w:t>AO EXMO. SR. DESEMBARGADOR PRESIDENTE</w:t>
+      </w:r>
+    </w:p>
+    <w:p>
+      <w:pPr>
+        <w:pStyle w:val="AECorpo"/>
+      </w:pPr>
+      <w:r>
+        <w:rPr>
+          <w:i/>
+        </w:rPr>
+        <w:t>Tribunal de Justiça do Estado de [UF]</w:t>
+      </w:r>
+    </w:p>
     <w:p/>
+    <w:p>
+      <w:pPr>
+        <w:pStyle w:val="AECorpo"/>
+      </w:pPr>
+      <w:r>
+        <w:t>Autos de origem nº _________________ — ___ª Vara _____ da Comarca de ___________/___</w:t>
+      </w:r>
+    </w:p>
+    <w:p/>
+    <w:p>
+      <w:pPr>
+        <w:pStyle w:val="AECorpo"/>
+      </w:pPr>
+      <w:r>
+        <w:t>[NOME DO AGRAVANTE], [nacionalidade], [estado civil], [profissão], portador do RG nº _______, CPF nº _______________, residente e domiciliado em [endereço completo], por intermédio de seu advogado que esta subscreve (OAB/SP nº ______), vem, respeitosamente, à presença de Vossa Excelência, com fundamento nos arts. 1.015, I, e 1.019, I, do Código de Processo Civil, interpor</w:t>
+      </w:r>
+    </w:p>
+    <w:p/>
+    <w:p>
+      <w:pPr>
+        <w:pStyle w:val="AETítulo1"/>
+        <w:jc w:val="center"/>
+      </w:pPr>
+      <w:r>
+        <w:rPr>
+          <w:rFonts w:ascii="Georgia" w:hAnsi="Georgia"/>
+          <w:b/>
+          <w:color w:val="0B2341"/>
+          <w:sz w:val="28"/>
+          <w:smallCaps/>
+          <w:spacing w:val="60"/>
+        </w:rPr>
+        <w:t>AGRAVO DE INSTRUMENTO</w:t>
+      </w:r>
+    </w:p>
+    <w:p>
+      <w:pPr>
+        <w:pStyle w:val="AETítulo1"/>
+        <w:jc w:val="center"/>
+      </w:pPr>
+      <w:r>
+        <w:rPr>
+          <w:rFonts w:ascii="Georgia" w:hAnsi="Georgia"/>
+          <w:b/>
+          <w:color w:val="0B2341"/>
+          <w:sz w:val="28"/>
+          <w:smallCaps/>
+          <w:spacing w:val="60"/>
+        </w:rPr>
+        <w:t>COM PEDIDO DE TUTELA RECURSAL</w:t>
+      </w:r>
+    </w:p>
+    <w:p>
+      <w:pPr>
+        <w:pStyle w:val="AEOrnamento"/>
+        <w:jc w:val="center"/>
+      </w:pPr>
+      <w:r>
+        <w:t>◆</w:t>
+      </w:r>
+    </w:p>
+    <w:p/>
+    <w:p>
+      <w:pPr>
+        <w:pStyle w:val="AECorpo"/>
+      </w:pPr>
+      <w:r>
+        <w:t>contra decisão proferida pelo juízo a quo nos autos em epígrafe, pelas razões de fato e de direito a seguir expostas, requerendo seja recebido e processado na forma da lei, para ao final ser conhecido e provido.</w:t>
+      </w:r>
+    </w:p>
+    <w:p/>
+    <w:tbl>
+      <w:tblPr>
+        <w:tblLook w:firstColumn="1" w:firstRow="1" w:lastColumn="0" w:lastRow="0" w:noHBand="0" w:noVBand="1" w:val="04A0"/>
+        <w:tblBorders>
+          <w:top w:val="none" w:sz="0" w:color="auto"/>
+          <w:left w:val="none" w:sz="0" w:color="auto"/>
+          <w:bottom w:val="none" w:sz="0" w:color="auto"/>
+          <w:right w:val="none" w:sz="0" w:color="auto"/>
+          <w:insideH w:val="none" w:sz="0" w:color="auto"/>
+          <w:insideV w:val="none" w:sz="0" w:color="auto"/>
+        </w:tblBorders>
+        <w:tblW w:w="9355" w:type="dxa"/>
+        <w:tblInd w:w="0" w:type="dxa"/>
+        <w:tblLayout w:type="fixed"/>
+      </w:tblPr>
+      <w:tblGrid>
+        <w:gridCol w:w="4677"/>
+        <w:gridCol w:w="4677"/>
+      </w:tblGrid>
+      <w:tr>
+        <w:tc>
+          <w:tcPr>
+            <w:tcW w:w="4677" w:type="dxa"/>
+            <w:tcBorders>
+              <w:top w:val="single" w:sz="4" w:color="173A63"/>
+              <w:bottom w:val="single" w:sz="4" w:color="173A63"/>
+              <w:left w:val="single" w:sz="4" w:color="173A63"/>
+              <w:right w:val="single" w:sz="4" w:color="173A63"/>
+            </w:tcBorders>
+          </w:tcPr>
+          <w:p>
+            <w:pPr>
+              <w:jc w:val="center"/>
+              <w:spacing w:before="120" w:after="0" w:lineRule="auto" w:line="240"/>
+            </w:pPr>
+            <w:r>
+              <w:rPr>
+                <w:rFonts w:ascii="Arial" w:hAnsi="Arial"/>
+                <w:color w:val="0B2341"/>
+                <w:sz w:val="16"/>
+                <w:spacing w:val="120"/>
+                <w:smallCaps/>
+              </w:rPr>
+              <w:t>DECISÃO RECORRIDA</w:t>
+            </w:r>
+          </w:p>
+          <w:p>
+            <w:pPr>
+              <w:jc w:val="center"/>
+              <w:spacing w:before="0" w:after="80" w:lineRule="auto" w:line="200"/>
+            </w:pPr>
+            <w:r>
+              <w:rPr>
+                <w:color w:val="B69A54"/>
+                <w:sz w:val="14"/>
+              </w:rPr>
+              <w:t>◆</w:t>
+            </w:r>
+          </w:p>
+          <w:p>
+            <w:pPr>
+              <w:jc w:val="both"/>
+              <w:spacing w:before="0" w:after="120" w:lineRule="auto" w:line="320"/>
+            </w:pPr>
+            <w:r>
+              <w:rPr>
+                <w:rFonts w:ascii="Times New Roman" w:hAnsi="Times New Roman"/>
+                <w:sz w:val="22"/>
+              </w:rPr>
+              <w:t>[Descrever aqui a decisão que está sendo impugnada, indicando o ponto específico objeto da reforma.]</w:t>
+            </w:r>
+          </w:p>
+        </w:tc>
+        <w:tc>
+          <w:tcPr>
+            <w:tcW w:w="4678" w:type="dxa"/>
+            <w:tcBorders>
+              <w:top w:val="single" w:sz="4" w:color="173A63"/>
+              <w:bottom w:val="single" w:sz="4" w:color="173A63"/>
+              <w:left w:val="single" w:sz="4" w:color="173A63"/>
+              <w:right w:val="single" w:sz="4" w:color="173A63"/>
+            </w:tcBorders>
+          </w:tcPr>
+          <w:p>
+            <w:pPr>
+              <w:jc w:val="center"/>
+              <w:spacing w:before="120" w:after="0" w:lineRule="auto" w:line="240"/>
+            </w:pPr>
+            <w:r>
+              <w:rPr>
+                <w:rFonts w:ascii="Arial" w:hAnsi="Arial"/>
+                <w:color w:val="0B2341"/>
+                <w:sz w:val="16"/>
+                <w:spacing w:val="120"/>
+                <w:smallCaps/>
+              </w:rPr>
+              <w:t>PEDIDO</w:t>
+            </w:r>
+          </w:p>
+          <w:p>
+            <w:pPr>
+              <w:jc w:val="center"/>
+              <w:spacing w:before="0" w:after="80" w:lineRule="auto" w:line="200"/>
+            </w:pPr>
+            <w:r>
+              <w:rPr>
+                <w:color w:val="B69A54"/>
+                <w:sz w:val="14"/>
+              </w:rPr>
+              <w:t>◆</w:t>
+            </w:r>
+          </w:p>
+          <w:p>
+            <w:pPr>
+              <w:jc w:val="both"/>
+              <w:spacing w:before="0" w:after="120" w:lineRule="auto" w:line="320"/>
+            </w:pPr>
+            <w:r>
+              <w:rPr>
+                <w:rFonts w:ascii="Times New Roman" w:hAnsi="Times New Roman"/>
+                <w:sz w:val="22"/>
+              </w:rPr>
+              <w:t>[Indicar o pedido de reforma, de forma objetiva e diretamente relacionada à decisão recorrida.]</w:t>
+            </w:r>
+          </w:p>
+        </w:tc>
+      </w:tr>
+    </w:tbl>
+    <w:p/>
+    <w:p>
+      <w:pPr>
+        <w:pStyle w:val="AETítulo1"/>
+        <w:jc w:val="center"/>
+      </w:pPr>
+      <w:r>
+        <w:rPr>
+          <w:rFonts w:ascii="Georgia" w:hAnsi="Georgia"/>
+          <w:color w:val="0B2341"/>
+          <w:sz w:val="22"/>
+          <w:spacing w:val="100"/>
+          <w:smallCaps/>
+        </w:rPr>
+        <w:t>JUSTIFICATIVA DA REFORMA</w:t>
+      </w:r>
+    </w:p>
+    <w:p>
+      <w:pPr>
+        <w:pStyle w:val="AEOrnamento"/>
+        <w:jc w:val="center"/>
+      </w:pPr>
+      <w:r>
+        <w:t>◆</w:t>
+      </w:r>
+    </w:p>
+    <w:p>
+      <w:pPr>
+        <w:ind w:left="454" w:hanging="454"/>
+        <w:jc w:val="both"/>
+        <w:spacing w:before="60" w:after="60" w:lineRule="auto" w:line="340"/>
+      </w:pPr>
+      <w:r>
+        <w:rPr>
+          <w:color w:val="B69A54"/>
+          <w:sz w:val="16"/>
+        </w:rPr>
+        <w:t xml:space="preserve">◆  </w:t>
+      </w:r>
+      <w:r>
+        <w:rPr>
+          <w:rFonts w:ascii="Times New Roman" w:hAnsi="Times New Roman"/>
+          <w:sz w:val="24"/>
+        </w:rPr>
+        <w:t>[Fundamento legal ou jurisprudencial 1 — descrever de forma concisa o argumento principal que justifica a reforma da decisão.]</w:t>
+      </w:r>
+    </w:p>
+    <w:p>
+      <w:pPr>
+        <w:ind w:left="454" w:hanging="454"/>
+        <w:jc w:val="both"/>
+        <w:spacing w:before="60" w:after="60" w:lineRule="auto" w:line="340"/>
+      </w:pPr>
+      <w:r>
+        <w:rPr>
+          <w:color w:val="B69A54"/>
+          <w:sz w:val="16"/>
+        </w:rPr>
+        <w:t xml:space="preserve">◆  </w:t>
+      </w:r>
+      <w:r>
+        <w:rPr>
+          <w:rFonts w:ascii="Times New Roman" w:hAnsi="Times New Roman"/>
+          <w:sz w:val="24"/>
+        </w:rPr>
+        <w:t>[Fundamento legal ou jurisprudencial 2 — indicar norma, súmula ou acórdão que ampara o pedido.]</w:t>
+      </w:r>
+    </w:p>
+    <w:p>
+      <w:pPr>
+        <w:ind w:left="454" w:hanging="454"/>
+        <w:jc w:val="both"/>
+        <w:spacing w:before="60" w:after="60" w:lineRule="auto" w:line="340"/>
+      </w:pPr>
+      <w:r>
+        <w:rPr>
+          <w:color w:val="B69A54"/>
+          <w:sz w:val="16"/>
+        </w:rPr>
+        <w:t xml:space="preserve">◆  </w:t>
+      </w:r>
+      <w:r>
+        <w:rPr>
+          <w:rFonts w:ascii="Times New Roman" w:hAnsi="Times New Roman"/>
+          <w:sz w:val="24"/>
+        </w:rPr>
+        <w:t>[Fundamento fático 3 — descrever como o caso concreto se enquadra nos fundamentos jurídicos apresentados.]</w:t>
+      </w:r>
+    </w:p>
+    <w:p/>
+    <w:p>
+      <w:pPr>
+        <w:pStyle w:val="AETítulo2"/>
+      </w:pPr>
+      <w:r>
+        <w:rPr>
+          <w:rFonts w:ascii="Georgia" w:hAnsi="Georgia"/>
+          <w:b/>
+          <w:color w:val="0B2341"/>
+          <w:sz w:val="24"/>
+          <w:spacing w:val="30"/>
+        </w:rPr>
+        <w:t>I — DO CABIMENTO</w:t>
+      </w:r>
+    </w:p>
+    <w:p>
+      <w:pPr>
+        <w:pStyle w:val="AECorpo"/>
+      </w:pPr>
+      <w:r>
+        <w:t>O presente recurso é tempestivo e cabível, nos termos do art. 1.015, I, do CPC, por versar sobre decisão que aprecia tutela provisória.</w:t>
+      </w:r>
+    </w:p>
+    <w:p/>
+    <w:p>
+      <w:pPr>
+        <w:pStyle w:val="AETítulo2"/>
+      </w:pPr>
+      <w:r>
+        <w:rPr>
+          <w:rFonts w:ascii="Georgia" w:hAnsi="Georgia"/>
+          <w:b/>
+          <w:color w:val="0B2341"/>
+          <w:sz w:val="24"/>
+          <w:spacing w:val="30"/>
+        </w:rPr>
+        <w:t>II — DA TUTELA RECURSAL</w:t>
+      </w:r>
+    </w:p>
+    <w:p>
+      <w:pPr>
+        <w:pStyle w:val="AECorpo"/>
+      </w:pPr>
+      <w:r>
+        <w:t>Presentes a probabilidade do direito e o perigo de dano ou risco ao resultado útil do processo (art. 300 c/c art. 1.019, I, do CPC), requer-se a concessão da tutela recursal inaudita altera pars.</w:t>
+      </w:r>
+    </w:p>
+    <w:p/>
+    <w:p>
+      <w:pPr>
+        <w:pStyle w:val="AETítulo2"/>
+      </w:pPr>
+      <w:r>
+        <w:rPr>
+          <w:rFonts w:ascii="Georgia" w:hAnsi="Georgia"/>
+          <w:b/>
+          <w:color w:val="0B2341"/>
+          <w:sz w:val="24"/>
+          <w:spacing w:val="30"/>
+        </w:rPr>
+        <w:t>III — DOS PEDIDOS</w:t>
+      </w:r>
+    </w:p>
+    <w:p>
+      <w:pPr>
+        <w:pStyle w:val="AECorpo"/>
+      </w:pPr>
+      <w:r>
+        <w:t>Ante o exposto, requer-se o conhecimento e provimento do presente agravo de instrumento, com a reforma integral da decisão agravada.</w:t>
+      </w:r>
+    </w:p>
+    <w:p/>
+    <w:p>
+      <w:pPr>
+        <w:pStyle w:val="AECorpo"/>
+      </w:pPr>
+      <w:r>
+        <w:t>Nestes termos, pede deferimento.</w:t>
+      </w:r>
+    </w:p>
+    <w:p/>
+    <w:p>
+      <w:pPr>
+        <w:pStyle w:val="AECorpo"/>
+      </w:pPr>
+      <w:r>
+        <w:t>[Cidade], _____ de _____________ de _______.</w:t>
+      </w:r>
+    </w:p>
+    <w:p/>
+    <w:p/>
+    <w:p>
+      <w:pPr>
+        <w:pStyle w:val="AECorpo"/>
+        <w:jc w:val="center"/>
+      </w:pPr>
+      <w:r>
+        <w:rPr>
+          <w:color w:val="0B2341"/>
+        </w:rPr>
+        <w:t>__________________________________________</w:t>
+      </w:r>
+    </w:p>
+    <w:p>
+      <w:pPr>
+        <w:pStyle w:val="AECorpo"/>
+        <w:jc w:val="center"/>
+      </w:pPr>
+      <w:r>
+        <w:rPr>
+          <w:b/>
+          <w:color w:val="0B2341"/>
+        </w:rPr>
+        <w:t>Vanildo Angelo Epifanio</w:t>
+      </w:r>
+    </w:p>
+    <w:p>
+      <w:pPr>
+        <w:pStyle w:val="AENota"/>
+        <w:jc w:val="center"/>
+      </w:pPr>
+      <w:r>
+        <w:t>Advogado — OAB/SP XXXXX</w:t>
+      </w:r>
+    </w:p>
     <w:sectPr>
       <w:headerReference w:type="default" r:id="rId9"/>
       <w:footerReference w:type="default" r:id="rId10"/>
-      <w:pgSz w:w="12240" w:h="15840"/>
-      <w:pgMar w:top="2551" w:right="1134" w:bottom="1417" w:left="2268" w:header="454" w:footer="680" w:gutter="0"/>
+      <w:pgSz w:w="11906" w:h="16838"/>
+      <w:pgMar w:top="1134" w:right="1134" w:bottom="1134" w:left="1417" w:header="283" w:footer="283" w:gutter="0"/>
       <w:cols w:space="720"/>
       <w:docGrid w:linePitch="360"/>
     </w:sectPr>
@@ -83,47 +562,68 @@
 <w:ftr xmlns:m="http://schemas.openxmlformats.org/officeDocument/2006/math" xmlns:mc="http://schemas.openxmlformats.org/markup-compatibility/2006" xmlns:mo="http://schemas.microsoft.com/office/mac/office/2008/main" xmlns:mv="urn:schemas-microsoft-com:mac:vml" xmlns:o="urn:schemas-microsoft-com:office:office" xmlns:r="http://schemas.openxmlformats.org/officeDocument/2006/relationships" xmlns:v="urn:schemas-microsoft-com:vml" xmlns:w10="urn:schemas-microsoft-com:office:word" xmlns:w14="http://schemas.microsoft.com/office/word/2010/wordml" xmlns:w="http://schemas.openxmlformats.org/wordprocessingml/2006/main" xmlns:wne="http://schemas.microsoft.com/office/word/2006/wordml" xmlns:wp14="http://schemas.microsoft.com/office/word/2010/wordprocessingDrawing" xmlns:wp="http://schemas.openxmlformats.org/drawingml/2006/wordprocessingDrawing" xmlns:wpc="http://schemas.microsoft.com/office/word/2010/wordprocessingCanvas" xmlns:wpg="http://schemas.microsoft.com/office/word/2010/wordprocessingGroup" xmlns:wpi="http://schemas.microsoft.com/office/word/2010/wordprocessingInk" xmlns:wps="http://schemas.microsoft.com/office/word/2010/wordprocessingShape" mc:Ignorable="w14 wp14">
   <w:tbl>
     <w:tblPr>
-      <w:tblW w:type="auto" w:w="0"/>
       <w:tblLook w:firstColumn="1" w:firstRow="1" w:lastColumn="0" w:lastRow="0" w:noHBand="0" w:noVBand="1" w:val="04A0"/>
       <w:tblBorders>
-        <w:top w:val="none" w:sz="0" w:space="0" w:color="auto"/>
-        <w:left w:val="none" w:sz="0" w:space="0" w:color="auto"/>
-        <w:bottom w:val="none" w:sz="0" w:space="0" w:color="auto"/>
-        <w:right w:val="none" w:sz="0" w:space="0" w:color="auto"/>
-        <w:insideH w:val="none" w:sz="0" w:space="0" w:color="auto"/>
-        <w:insideV w:val="none" w:sz="0" w:space="0" w:color="auto"/>
+        <w:top w:val="none" w:sz="0" w:color="auto"/>
+        <w:left w:val="none" w:sz="0" w:color="auto"/>
+        <w:bottom w:val="none" w:sz="0" w:color="auto"/>
+        <w:right w:val="none" w:sz="0" w:color="auto"/>
+        <w:insideH w:val="none" w:sz="0" w:color="auto"/>
+        <w:insideV w:val="none" w:sz="0" w:color="auto"/>
       </w:tblBorders>
-      <w:tblW w:w="5000" w:type="pct"/>
+      <w:tblW w:w="11906" w:type="dxa"/>
+      <w:tblInd w:w="-1417" w:type="dxa"/>
+      <w:tblLayout w:type="fixed"/>
     </w:tblPr>
     <w:tblGrid>
-      <w:gridCol w:w="3118"/>
-      <w:gridCol w:w="3118"/>
-      <w:gridCol w:w="3118"/>
+      <w:gridCol w:w="3969"/>
+      <w:gridCol w:w="3969"/>
+      <w:gridCol w:w="3969"/>
     </w:tblGrid>
     <w:tr>
       <w:tc>
         <w:tcPr>
-          <w:tcW w:type="dxa" w:w="3402"/>
-          <w:shd w:val="clear" w:color="auto" w:fill="0D2340"/>
+          <w:tcW w:w="4252" w:type="dxa"/>
+          <w:tcBorders>
+            <w:top w:val="none" w:sz="0" w:color="auto"/>
+            <w:left w:val="none" w:sz="0" w:color="auto"/>
+            <w:bottom w:val="none" w:sz="0" w:color="auto"/>
+            <w:right w:val="none" w:sz="0" w:color="auto"/>
+            <w:insideH w:val="none" w:sz="0" w:color="auto"/>
+            <w:insideV w:val="none" w:sz="0" w:color="auto"/>
+          </w:tcBorders>
+          <w:shd w:val="clear" w:color="auto" w:fill="0B2341"/>
+          <w:vAlign w:val="center"/>
         </w:tcPr>
         <w:p>
           <w:pPr>
             <w:jc w:val="left"/>
-            <w:spacing w:before="60" w:after="60"/>
+            <w:spacing w:before="120" w:after="120" w:lineRule="auto" w:line="240"/>
           </w:pPr>
           <w:r>
             <w:rPr>
-              <w:rFonts w:ascii="Times New Roman" w:hAnsi="Times New Roman"/>
+              <w:rFonts w:ascii="Georgia" w:hAnsi="Georgia"/>
               <w:b/>
               <w:color w:val="FFFFFF"/>
-              <w:sz w:val="20"/>
+              <w:sz w:val="22"/>
+              <w:spacing w:val="60"/>
             </w:rPr>
-            <w:t xml:space="preserve">AE  </w:t>
+            <w:t>AE</w:t>
           </w:r>
           <w:r>
             <w:rPr>
-              <w:color w:val="B4C8DC"/>
+              <w:rFonts w:ascii="Georgia" w:hAnsi="Georgia"/>
+              <w:color w:val="B69A54"/>
+              <w:sz w:val="18"/>
+            </w:rPr>
+            <w:t xml:space="preserve">  |  </w:t>
+          </w:r>
+          <w:r>
+            <w:rPr>
+              <w:rFonts w:ascii="Arial" w:hAnsi="Arial"/>
+              <w:color w:val="FFFFFF"/>
               <w:sz w:val="14"/>
+              <w:spacing w:val="30"/>
             </w:rPr>
             <w:t>ANGELO EPIFANIO ADVOCACIA</w:t>
           </w:r>
@@ -131,17 +631,27 @@
       </w:tc>
       <w:tc>
         <w:tcPr>
-          <w:tcW w:type="dxa" w:w="4535"/>
-          <w:shd w:val="clear" w:color="auto" w:fill="0D2340"/>
+          <w:tcW w:w="5953" w:type="dxa"/>
+          <w:tcBorders>
+            <w:top w:val="none" w:sz="0" w:color="auto"/>
+            <w:left w:val="none" w:sz="0" w:color="auto"/>
+            <w:bottom w:val="none" w:sz="0" w:color="auto"/>
+            <w:right w:val="none" w:sz="0" w:color="auto"/>
+            <w:insideH w:val="none" w:sz="0" w:color="auto"/>
+            <w:insideV w:val="none" w:sz="0" w:color="auto"/>
+          </w:tcBorders>
+          <w:shd w:val="clear" w:color="auto" w:fill="0B2341"/>
+          <w:vAlign w:val="center"/>
         </w:tcPr>
         <w:p>
           <w:pPr>
             <w:jc w:val="center"/>
-            <w:spacing w:before="60" w:after="60"/>
+            <w:spacing w:before="120" w:after="120" w:lineRule="auto" w:line="240"/>
           </w:pPr>
           <w:r>
             <w:rPr>
-              <w:color w:val="B4C8DC"/>
+              <w:rFonts w:ascii="Arial" w:hAnsi="Arial"/>
+              <w:color w:val="A0B9D2"/>
               <w:sz w:val="13"/>
             </w:rPr>
             <w:t>www.angeloepifanio.com.br  |  contato@angeloepifanio.com.br  |  São José dos Campos/SP</w:t>
@@ -150,19 +660,29 @@
       </w:tc>
       <w:tc>
         <w:tcPr>
-          <w:tcW w:type="dxa" w:w="1417"/>
-          <w:shd w:val="clear" w:color="auto" w:fill="0D2340"/>
+          <w:tcW w:w="1701" w:type="dxa"/>
+          <w:tcBorders>
+            <w:top w:val="none" w:sz="0" w:color="auto"/>
+            <w:left w:val="none" w:sz="0" w:color="auto"/>
+            <w:bottom w:val="none" w:sz="0" w:color="auto"/>
+            <w:right w:val="none" w:sz="0" w:color="auto"/>
+            <w:insideH w:val="none" w:sz="0" w:color="auto"/>
+            <w:insideV w:val="none" w:sz="0" w:color="auto"/>
+          </w:tcBorders>
+          <w:shd w:val="clear" w:color="auto" w:fill="0B2341"/>
+          <w:vAlign w:val="center"/>
         </w:tcPr>
         <w:p>
           <w:pPr>
             <w:jc w:val="right"/>
-            <w:spacing w:before="60" w:after="60"/>
+            <w:spacing w:before="120" w:after="120" w:lineRule="auto" w:line="240"/>
           </w:pPr>
           <w:r>
             <w:rPr>
+              <w:rFonts w:ascii="Arial" w:hAnsi="Arial"/>
               <w:b/>
               <w:color w:val="FFFFFF"/>
-              <w:sz w:val="16"/>
+              <w:sz w:val="18"/>
             </w:rPr>
             <w:fldChar w:fldCharType="begin"/>
             <w:instrText xml:space="preserve"> PAGE </w:instrText>
@@ -179,48 +699,192 @@
 
 <file path=word/header1.xml><?xml version="1.0" encoding="utf-8"?>
 <w:hdr xmlns:m="http://schemas.openxmlformats.org/officeDocument/2006/math" xmlns:mc="http://schemas.openxmlformats.org/markup-compatibility/2006" xmlns:mo="http://schemas.microsoft.com/office/mac/office/2008/main" xmlns:mv="urn:schemas-microsoft-com:mac:vml" xmlns:o="urn:schemas-microsoft-com:office:office" xmlns:r="http://schemas.openxmlformats.org/officeDocument/2006/relationships" xmlns:v="urn:schemas-microsoft-com:vml" xmlns:w10="urn:schemas-microsoft-com:office:word" xmlns:w14="http://schemas.microsoft.com/office/word/2010/wordml" xmlns:w="http://schemas.openxmlformats.org/wordprocessingml/2006/main" xmlns:wne="http://schemas.microsoft.com/office/word/2006/wordml" xmlns:wp14="http://schemas.microsoft.com/office/word/2010/wordprocessingDrawing" xmlns:wp="http://schemas.openxmlformats.org/drawingml/2006/wordprocessingDrawing" xmlns:wpc="http://schemas.microsoft.com/office/word/2010/wordprocessingCanvas" xmlns:wpg="http://schemas.microsoft.com/office/word/2010/wordprocessingGroup" xmlns:wpi="http://schemas.microsoft.com/office/word/2010/wordprocessingInk" xmlns:wps="http://schemas.microsoft.com/office/word/2010/wordprocessingShape" mc:Ignorable="w14 wp14">
-  <w:p>
-    <w:pPr>
-      <w:jc w:val="center"/>
-      <w:pBdr>
-        <w:bottom w:val="single" w:sz="4" w:space="4" w:color="1A3A5C"/>
-      </w:pBdr>
-    </w:pPr>
-    <w:r>
-      <w:drawing>
-        <wp:inline xmlns:a="http://schemas.openxmlformats.org/drawingml/2006/main" xmlns:pic="http://schemas.openxmlformats.org/drawingml/2006/picture">
-          <wp:extent cx="5940000" cy="908471"/>
-          <wp:docPr id="1" name="Picture 1"/>
-          <wp:cNvGraphicFramePr>
-            <a:graphicFrameLocks noChangeAspect="1"/>
-          </wp:cNvGraphicFramePr>
-          <a:graphic>
-            <a:graphicData uri="http://schemas.openxmlformats.org/drawingml/2006/picture">
-              <pic:pic>
-                <pic:nvPicPr>
-                  <pic:cNvPr id="0" name="_header_tmp.png"/>
-                  <pic:cNvPicPr/>
-                </pic:nvPicPr>
-                <pic:blipFill>
-                  <a:blip r:embed="rId1"/>
-                  <a:stretch>
-                    <a:fillRect/>
-                  </a:stretch>
-                </pic:blipFill>
-                <pic:spPr>
-                  <a:xfrm>
-                    <a:off x="0" y="0"/>
-                    <a:ext cx="5940000" cy="908471"/>
-                  </a:xfrm>
-                  <a:prstGeom prst="rect"/>
-                </pic:spPr>
-              </pic:pic>
-            </a:graphicData>
-          </a:graphic>
-        </wp:inline>
-      </w:drawing>
-    </w:r>
-  </w:p>
+  <w:tbl>
+    <w:tblPr>
+      <w:tblLook w:firstColumn="1" w:firstRow="1" w:lastColumn="0" w:lastRow="0" w:noHBand="0" w:noVBand="1" w:val="04A0"/>
+      <w:tblBorders>
+        <w:top w:val="none" w:sz="0" w:color="auto"/>
+        <w:left w:val="none" w:sz="0" w:color="auto"/>
+        <w:bottom w:val="none" w:sz="0" w:color="auto"/>
+        <w:right w:val="none" w:sz="0" w:color="auto"/>
+        <w:insideH w:val="none" w:sz="0" w:color="auto"/>
+        <w:insideV w:val="none" w:sz="0" w:color="auto"/>
+      </w:tblBorders>
+      <w:tblW w:w="9355" w:type="dxa"/>
+      <w:tblInd w:w="0" w:type="dxa"/>
+      <w:tblLayout w:type="fixed"/>
+    </w:tblPr>
+    <w:tblGrid>
+      <w:gridCol w:w="3118"/>
+      <w:gridCol w:w="3118"/>
+      <w:gridCol w:w="3118"/>
+    </w:tblGrid>
+    <w:tr>
+      <w:tc>
+        <w:tcPr>
+          <w:tcW w:w="851" w:type="dxa"/>
+          <w:tcBorders>
+            <w:top w:val="none" w:sz="0" w:color="auto"/>
+            <w:left w:val="none" w:sz="0" w:color="auto"/>
+            <w:bottom w:val="none" w:sz="0" w:color="auto"/>
+            <w:right w:val="none" w:sz="0" w:color="auto"/>
+            <w:insideH w:val="none" w:sz="0" w:color="auto"/>
+            <w:insideV w:val="none" w:sz="0" w:color="auto"/>
+          </w:tcBorders>
+          <w:vAlign w:val="center"/>
+        </w:tcPr>
+        <w:p/>
+      </w:tc>
+      <w:tc>
+        <w:tcPr>
+          <w:tcW w:w="5669" w:type="dxa"/>
+          <w:tcBorders>
+            <w:top w:val="none" w:sz="0" w:color="auto"/>
+            <w:left w:val="none" w:sz="0" w:color="auto"/>
+            <w:bottom w:val="none" w:sz="0" w:color="auto"/>
+            <w:right w:val="none" w:sz="0" w:color="auto"/>
+            <w:insideH w:val="none" w:sz="0" w:color="auto"/>
+            <w:insideV w:val="none" w:sz="0" w:color="auto"/>
+          </w:tcBorders>
+          <w:vAlign w:val="center"/>
+        </w:tcPr>
+        <w:p>
+          <w:pPr>
+            <w:jc w:val="center"/>
+            <w:spacing w:before="80" w:after="40" w:lineRule="auto" w:line="240"/>
+            <w:pBdr>
+              <w:bottom w:val="single" w:sz="4" w:space="3" w:color="B69A54"/>
+            </w:pBdr>
+          </w:pPr>
+          <w:r>
+            <w:rPr>
+              <w:rFonts w:ascii="Georgia" w:hAnsi="Georgia"/>
+              <w:b/>
+              <w:color w:val="0B2341"/>
+              <w:sz w:val="56"/>
+              <w:spacing w:val="80"/>
+            </w:rPr>
+            <w:t>AE</w:t>
+          </w:r>
+        </w:p>
+        <w:p>
+          <w:pPr>
+            <w:jc w:val="center"/>
+            <w:spacing w:before="80" w:after="0" w:lineRule="auto" w:line="240"/>
+            <w:pBdr>
+              <w:bottom w:val="single" w:sz="4" w:space="3" w:color="B69A54"/>
+            </w:pBdr>
+          </w:pPr>
+          <w:r>
+            <w:rPr>
+              <w:rFonts w:ascii="Georgia" w:hAnsi="Georgia"/>
+              <w:b/>
+              <w:color w:val="0B2341"/>
+              <w:sz w:val="18"/>
+              <w:spacing w:val="100"/>
+            </w:rPr>
+            <w:t>ANGELO EPIFANIO</w:t>
+          </w:r>
+        </w:p>
+        <w:p>
+          <w:pPr>
+            <w:jc w:val="center"/>
+            <w:spacing w:before="60" w:after="80" w:lineRule="auto" w:line="240"/>
+          </w:pPr>
+          <w:r>
+            <w:rPr>
+              <w:rFonts w:ascii="Arial" w:hAnsi="Arial"/>
+              <w:color w:val="8A9099"/>
+              <w:sz w:val="15"/>
+              <w:spacing w:val="160"/>
+            </w:rPr>
+            <w:t>ADVOCACIA</w:t>
+          </w:r>
+        </w:p>
+      </w:tc>
+      <w:tc>
+        <w:tcPr>
+          <w:tcW w:w="2835" w:type="dxa"/>
+          <w:tcBorders>
+            <w:top w:val="none" w:sz="0" w:color="auto"/>
+            <w:left w:val="none" w:sz="0" w:color="auto"/>
+            <w:bottom w:val="none" w:sz="0" w:color="auto"/>
+            <w:right w:val="none" w:sz="0" w:color="auto"/>
+            <w:insideH w:val="none" w:sz="0" w:color="auto"/>
+            <w:insideV w:val="none" w:sz="0" w:color="auto"/>
+          </w:tcBorders>
+          <w:vAlign w:val="center"/>
+        </w:tcPr>
+        <w:p>
+          <w:pPr>
+            <w:jc w:val="right"/>
+            <w:spacing w:before="0" w:after="20" w:lineRule="auto" w:line="240"/>
+          </w:pPr>
+          <w:r>
+            <w:rPr>
+              <w:rFonts w:ascii="Arial" w:hAnsi="Arial"/>
+              <w:b/>
+              <w:color w:val="0B2341"/>
+              <w:sz w:val="18"/>
+              <w:spacing w:val="80"/>
+            </w:rPr>
+            <w:t>OAB/SP XXXXX</w:t>
+          </w:r>
+        </w:p>
+        <w:p>
+          <w:pPr>
+            <w:jc w:val="right"/>
+            <w:spacing w:before="0" w:after="20" w:lineRule="auto" w:line="240"/>
+          </w:pPr>
+        </w:p>
+        <w:p>
+          <w:pPr>
+            <w:jc w:val="right"/>
+            <w:spacing w:before="0" w:after="20" w:lineRule="auto" w:line="240"/>
+          </w:pPr>
+          <w:r>
+            <w:rPr>
+              <w:rFonts w:ascii="Arial" w:hAnsi="Arial"/>
+              <w:b w:val="0"/>
+              <w:color w:val="8A9099"/>
+              <w:sz w:val="15"/>
+            </w:rPr>
+            <w:t>www.angeloepifanio.com.br</w:t>
+          </w:r>
+        </w:p>
+        <w:p>
+          <w:pPr>
+            <w:jc w:val="right"/>
+            <w:spacing w:before="0" w:after="20" w:lineRule="auto" w:line="240"/>
+          </w:pPr>
+          <w:r>
+            <w:rPr>
+              <w:rFonts w:ascii="Arial" w:hAnsi="Arial"/>
+              <w:b w:val="0"/>
+              <w:color w:val="8A9099"/>
+              <w:sz w:val="15"/>
+            </w:rPr>
+            <w:t>contato@angeloepifanio.com.br</w:t>
+          </w:r>
+        </w:p>
+        <w:p>
+          <w:pPr>
+            <w:jc w:val="right"/>
+            <w:spacing w:before="0" w:after="20" w:lineRule="auto" w:line="240"/>
+          </w:pPr>
+          <w:r>
+            <w:rPr>
+              <w:rFonts w:ascii="Arial" w:hAnsi="Arial"/>
+              <w:b w:val="0"/>
+              <w:color w:val="8A9099"/>
+              <w:sz w:val="15"/>
+            </w:rPr>
+            <w:t>(12) 99999-9999</w:t>
+          </w:r>
+        </w:p>
+      </w:tc>
+    </w:tr>
+  </w:tbl>
 </w:hdr>
 </file>
 
@@ -12269,6 +12933,112 @@
         <w:shd w:val="clear" w:color="auto" w:fill="FBCAA2" w:themeFill="accent6" w:themeFillTint="7F"/>
       </w:tcPr>
     </w:tblStylePr>
+  </w:style>
+  <w:style w:type="paragraph" w:customStyle="1" w:styleId="AETítulo1">
+    <w:name w:val="AE Título 1"/>
+    <w:pPr>
+      <w:spacing w:before="240" w:after="120" w:line="360" w:lineRule="exact"/>
+      <w:jc w:val="center"/>
+    </w:pPr>
+    <w:rPr>
+      <w:rFonts w:ascii="Georgia" w:hAnsi="Georgia"/>
+      <w:b/>
+      <w:i w:val="0"/>
+      <w:color w:val="0B2341"/>
+      <w:sz w:val="28"/>
+    </w:rPr>
+  </w:style>
+  <w:style w:type="paragraph" w:customStyle="1" w:styleId="AETítulo2">
+    <w:name w:val="AE Título 2"/>
+    <w:pPr>
+      <w:spacing w:before="200" w:after="80" w:line="360" w:lineRule="exact"/>
+    </w:pPr>
+    <w:rPr>
+      <w:rFonts w:ascii="Georgia" w:hAnsi="Georgia"/>
+      <w:b/>
+      <w:i w:val="0"/>
+      <w:color w:val="0B2341"/>
+      <w:sz w:val="24"/>
+    </w:rPr>
+  </w:style>
+  <w:style w:type="paragraph" w:customStyle="1" w:styleId="AETítulo3">
+    <w:name w:val="AE Título 3"/>
+    <w:pPr>
+      <w:spacing w:before="160" w:after="80" w:line="360" w:lineRule="exact"/>
+    </w:pPr>
+    <w:rPr>
+      <w:rFonts w:ascii="Georgia" w:hAnsi="Georgia"/>
+      <w:b/>
+      <w:i/>
+      <w:color w:val="173A63"/>
+      <w:sz w:val="22"/>
+    </w:rPr>
+  </w:style>
+  <w:style w:type="paragraph" w:customStyle="1" w:styleId="AECorpo">
+    <w:name w:val="AE Corpo"/>
+    <w:pPr>
+      <w:spacing w:before="0" w:after="120" w:line="360" w:lineRule="exact"/>
+      <w:jc w:val="both"/>
+    </w:pPr>
+    <w:rPr>
+      <w:rFonts w:ascii="Times New Roman" w:hAnsi="Times New Roman"/>
+      <w:b w:val="0"/>
+      <w:i w:val="0"/>
+      <w:sz w:val="24"/>
+    </w:rPr>
+  </w:style>
+  <w:style w:type="paragraph" w:customStyle="1" w:styleId="AECitação">
+    <w:name w:val="AE Citação"/>
+    <w:pPr>
+      <w:spacing w:before="120" w:after="120" w:line="340" w:lineRule="exact"/>
+      <w:jc w:val="both"/>
+    </w:pPr>
+    <w:rPr>
+      <w:rFonts w:ascii="Times New Roman" w:hAnsi="Times New Roman"/>
+      <w:b w:val="0"/>
+      <w:i/>
+      <w:color w:val="173A63"/>
+      <w:sz w:val="22"/>
+    </w:rPr>
+  </w:style>
+  <w:style w:type="paragraph" w:customStyle="1" w:styleId="AENota">
+    <w:name w:val="AE Nota"/>
+    <w:pPr>
+      <w:spacing w:before="0" w:after="60" w:line="240" w:lineRule="exact"/>
+    </w:pPr>
+    <w:rPr>
+      <w:rFonts w:ascii="Arial" w:hAnsi="Arial"/>
+      <w:b w:val="0"/>
+      <w:i w:val="0"/>
+      <w:color w:val="8A9099"/>
+      <w:sz w:val="18"/>
+    </w:rPr>
+  </w:style>
+  <w:style w:type="paragraph" w:customStyle="1" w:styleId="AEEndereçamento">
+    <w:name w:val="AE Endereçamento"/>
+    <w:pPr>
+      <w:spacing w:before="0" w:after="80" w:line="360" w:lineRule="exact"/>
+    </w:pPr>
+    <w:rPr>
+      <w:rFonts w:ascii="Times New Roman" w:hAnsi="Times New Roman"/>
+      <w:b/>
+      <w:i w:val="0"/>
+      <w:sz w:val="24"/>
+    </w:rPr>
+  </w:style>
+  <w:style w:type="paragraph" w:customStyle="1" w:styleId="AEOrnamento">
+    <w:name w:val="AE Ornamento"/>
+    <w:pPr>
+      <w:spacing w:before="80" w:after="80" w:line="240" w:lineRule="exact"/>
+      <w:jc w:val="center"/>
+    </w:pPr>
+    <w:rPr>
+      <w:rFonts w:ascii="Georgia" w:hAnsi="Georgia"/>
+      <w:b w:val="0"/>
+      <w:i w:val="0"/>
+      <w:color w:val="B69A54"/>
+      <w:sz w:val="20"/>
+    </w:rPr>
   </w:style>
 </w:styles>
 </file>

</xml_diff>

<commit_message>
fix: rodapé usa parágrafo com w:ind negativo — shading cobre borda a borda
</commit_message>
<xml_diff>
--- a/Modelos jus/AGRAVO_INSTRUMENTO.docx
+++ b/Modelos jus/AGRAVO_INSTRUMENTO.docx
@@ -560,140 +560,92 @@
 
 <file path=word/footer1.xml><?xml version="1.0" encoding="utf-8"?>
 <w:ftr xmlns:m="http://schemas.openxmlformats.org/officeDocument/2006/math" xmlns:mc="http://schemas.openxmlformats.org/markup-compatibility/2006" xmlns:mo="http://schemas.microsoft.com/office/mac/office/2008/main" xmlns:mv="urn:schemas-microsoft-com:mac:vml" xmlns:o="urn:schemas-microsoft-com:office:office" xmlns:r="http://schemas.openxmlformats.org/officeDocument/2006/relationships" xmlns:v="urn:schemas-microsoft-com:vml" xmlns:w10="urn:schemas-microsoft-com:office:word" xmlns:w14="http://schemas.microsoft.com/office/word/2010/wordml" xmlns:w="http://schemas.openxmlformats.org/wordprocessingml/2006/main" xmlns:wne="http://schemas.microsoft.com/office/word/2006/wordml" xmlns:wp14="http://schemas.microsoft.com/office/word/2010/wordprocessingDrawing" xmlns:wp="http://schemas.openxmlformats.org/drawingml/2006/wordprocessingDrawing" xmlns:wpc="http://schemas.microsoft.com/office/word/2010/wordprocessingCanvas" xmlns:wpg="http://schemas.microsoft.com/office/word/2010/wordprocessingGroup" xmlns:wpi="http://schemas.microsoft.com/office/word/2010/wordprocessingInk" xmlns:wps="http://schemas.microsoft.com/office/word/2010/wordprocessingShape" mc:Ignorable="w14 wp14">
-  <w:tbl>
-    <w:tblPr>
-      <w:tblLook w:firstColumn="1" w:firstRow="1" w:lastColumn="0" w:lastRow="0" w:noHBand="0" w:noVBand="1" w:val="04A0"/>
-      <w:tblBorders>
-        <w:top w:val="none" w:sz="0" w:color="auto"/>
-        <w:left w:val="none" w:sz="0" w:color="auto"/>
-        <w:bottom w:val="none" w:sz="0" w:color="auto"/>
-        <w:right w:val="none" w:sz="0" w:color="auto"/>
-        <w:insideH w:val="none" w:sz="0" w:color="auto"/>
-        <w:insideV w:val="none" w:sz="0" w:color="auto"/>
-      </w:tblBorders>
-      <w:tblW w:w="11906" w:type="dxa"/>
-      <w:tblInd w:w="-1417" w:type="dxa"/>
-      <w:tblLayout w:type="fixed"/>
-    </w:tblPr>
-    <w:tblGrid>
-      <w:gridCol w:w="3969"/>
-      <w:gridCol w:w="3969"/>
-      <w:gridCol w:w="3969"/>
-    </w:tblGrid>
-    <w:tr>
-      <w:tc>
-        <w:tcPr>
-          <w:tcW w:w="4252" w:type="dxa"/>
-          <w:tcBorders>
-            <w:top w:val="none" w:sz="0" w:color="auto"/>
-            <w:left w:val="none" w:sz="0" w:color="auto"/>
-            <w:bottom w:val="none" w:sz="0" w:color="auto"/>
-            <w:right w:val="none" w:sz="0" w:color="auto"/>
-            <w:insideH w:val="none" w:sz="0" w:color="auto"/>
-            <w:insideV w:val="none" w:sz="0" w:color="auto"/>
-          </w:tcBorders>
-          <w:shd w:val="clear" w:color="auto" w:fill="0B2341"/>
-          <w:vAlign w:val="center"/>
-        </w:tcPr>
-        <w:p>
-          <w:pPr>
-            <w:jc w:val="left"/>
-            <w:spacing w:before="120" w:after="120" w:lineRule="auto" w:line="240"/>
-          </w:pPr>
-          <w:r>
-            <w:rPr>
-              <w:rFonts w:ascii="Georgia" w:hAnsi="Georgia"/>
-              <w:b/>
-              <w:color w:val="FFFFFF"/>
-              <w:sz w:val="22"/>
-              <w:spacing w:val="60"/>
-            </w:rPr>
-            <w:t>AE</w:t>
-          </w:r>
-          <w:r>
-            <w:rPr>
-              <w:rFonts w:ascii="Georgia" w:hAnsi="Georgia"/>
-              <w:color w:val="B69A54"/>
-              <w:sz w:val="18"/>
-            </w:rPr>
-            <w:t xml:space="preserve">  |  </w:t>
-          </w:r>
-          <w:r>
-            <w:rPr>
-              <w:rFonts w:ascii="Arial" w:hAnsi="Arial"/>
-              <w:color w:val="FFFFFF"/>
-              <w:sz w:val="14"/>
-              <w:spacing w:val="30"/>
-            </w:rPr>
-            <w:t>ANGELO EPIFANIO ADVOCACIA</w:t>
-          </w:r>
-        </w:p>
-      </w:tc>
-      <w:tc>
-        <w:tcPr>
-          <w:tcW w:w="5953" w:type="dxa"/>
-          <w:tcBorders>
-            <w:top w:val="none" w:sz="0" w:color="auto"/>
-            <w:left w:val="none" w:sz="0" w:color="auto"/>
-            <w:bottom w:val="none" w:sz="0" w:color="auto"/>
-            <w:right w:val="none" w:sz="0" w:color="auto"/>
-            <w:insideH w:val="none" w:sz="0" w:color="auto"/>
-            <w:insideV w:val="none" w:sz="0" w:color="auto"/>
-          </w:tcBorders>
-          <w:shd w:val="clear" w:color="auto" w:fill="0B2341"/>
-          <w:vAlign w:val="center"/>
-        </w:tcPr>
-        <w:p>
-          <w:pPr>
-            <w:jc w:val="center"/>
-            <w:spacing w:before="120" w:after="120" w:lineRule="auto" w:line="240"/>
-          </w:pPr>
-          <w:r>
-            <w:rPr>
-              <w:rFonts w:ascii="Arial" w:hAnsi="Arial"/>
-              <w:color w:val="A0B9D2"/>
-              <w:sz w:val="13"/>
-            </w:rPr>
-            <w:t>www.angeloepifanio.com.br  |  contato@angeloepifanio.com.br  |  São José dos Campos/SP</w:t>
-          </w:r>
-        </w:p>
-      </w:tc>
-      <w:tc>
-        <w:tcPr>
-          <w:tcW w:w="1701" w:type="dxa"/>
-          <w:tcBorders>
-            <w:top w:val="none" w:sz="0" w:color="auto"/>
-            <w:left w:val="none" w:sz="0" w:color="auto"/>
-            <w:bottom w:val="none" w:sz="0" w:color="auto"/>
-            <w:right w:val="none" w:sz="0" w:color="auto"/>
-            <w:insideH w:val="none" w:sz="0" w:color="auto"/>
-            <w:insideV w:val="none" w:sz="0" w:color="auto"/>
-          </w:tcBorders>
-          <w:shd w:val="clear" w:color="auto" w:fill="0B2341"/>
-          <w:vAlign w:val="center"/>
-        </w:tcPr>
-        <w:p>
-          <w:pPr>
-            <w:jc w:val="right"/>
-            <w:spacing w:before="120" w:after="120" w:lineRule="auto" w:line="240"/>
-          </w:pPr>
-          <w:r>
-            <w:rPr>
-              <w:rFonts w:ascii="Arial" w:hAnsi="Arial"/>
-              <w:b/>
-              <w:color w:val="FFFFFF"/>
-              <w:sz w:val="18"/>
-            </w:rPr>
-            <w:fldChar w:fldCharType="begin"/>
-            <w:instrText xml:space="preserve"> PAGE </w:instrText>
-            <w:fldChar w:fldCharType="separate"/>
-            <w:t>0</w:t>
-            <w:fldChar w:fldCharType="end"/>
-          </w:r>
-        </w:p>
-      </w:tc>
-    </w:tr>
-  </w:tbl>
+  <w:p>
+    <w:pPr>
+      <w:shd w:val="clear" w:color="auto" w:fill="0B2341"/>
+      <w:ind w:left="-1417" w:right="-1134"/>
+      <w:spacing w:before="100" w:after="100" w:line="240" w:lineRule="auto"/>
+      <w:tabs>
+        <w:tab w:val="center" w:pos="4536"/>
+        <w:tab w:val="right" w:pos="10489"/>
+      </w:tabs>
+    </w:pPr>
+    <w:r>
+      <w:rPr>
+        <w:rFonts w:ascii="Arial" w:hAnsi="Arial"/>
+        <w:b w:val="0"/>
+        <w:color w:val="FFFFFF"/>
+        <w:sz w:val="16"/>
+      </w:rPr>
+      <w:t xml:space="preserve">  </w:t>
+    </w:r>
+    <w:r>
+      <w:rPr>
+        <w:rFonts w:ascii="Arial" w:hAnsi="Arial"/>
+        <w:b/>
+        <w:color w:val="FFFFFF"/>
+        <w:sz w:val="20"/>
+        <w:spacing w:val="50"/>
+      </w:rPr>
+      <w:t>AE</w:t>
+    </w:r>
+    <w:r>
+      <w:rPr>
+        <w:rFonts w:ascii="Arial" w:hAnsi="Arial"/>
+        <w:b w:val="0"/>
+        <w:color w:val="B69A54"/>
+        <w:sz w:val="18"/>
+      </w:rPr>
+      <w:t xml:space="preserve">  |  </w:t>
+    </w:r>
+    <w:r>
+      <w:rPr>
+        <w:rFonts w:ascii="Arial" w:hAnsi="Arial"/>
+        <w:b w:val="0"/>
+        <w:color w:val="FFFFFF"/>
+        <w:sz w:val="14"/>
+        <w:spacing w:val="20"/>
+      </w:rPr>
+      <w:t>ANGELO EPIFANIO ADVOCACIA</w:t>
+    </w:r>
+    <w:r>
+      <w:tab/>
+    </w:r>
+    <w:r>
+      <w:rPr>
+        <w:rFonts w:ascii="Arial" w:hAnsi="Arial"/>
+        <w:b w:val="0"/>
+        <w:color w:val="A0B9D2"/>
+        <w:sz w:val="13"/>
+      </w:rPr>
+      <w:t>www.angeloepifanio.com.br  |  contato@angeloepifanio.com.br  |  São José dos Campos/SP</w:t>
+    </w:r>
+    <w:r>
+      <w:tab/>
+    </w:r>
+    <w:r>
+      <w:rPr>
+        <w:rFonts w:ascii="Arial" w:hAnsi="Arial"/>
+        <w:b/>
+        <w:color w:val="FFFFFF"/>
+        <w:sz w:val="18"/>
+      </w:rPr>
+      <w:fldChar w:fldCharType="begin"/>
+      <w:instrText xml:space="preserve"> PAGE </w:instrText>
+      <w:fldChar w:fldCharType="separate"/>
+      <w:t>0</w:t>
+      <w:fldChar w:fldCharType="end"/>
+    </w:r>
+    <w:r>
+      <w:rPr>
+        <w:rFonts w:ascii="Arial" w:hAnsi="Arial"/>
+        <w:b w:val="0"/>
+        <w:color w:val="FFFFFF"/>
+        <w:sz w:val="16"/>
+      </w:rPr>
+      <w:t xml:space="preserve">  </w:t>
+    </w:r>
+  </w:p>
 </w:ftr>
 </file>
 

</xml_diff>

<commit_message>
fix: rodapé — tab stops corretos, faixa mais alta (before/after=300)
</commit_message>
<xml_diff>
--- a/Modelos jus/AGRAVO_INSTRUMENTO.docx
+++ b/Modelos jus/AGRAVO_INSTRUMENTO.docx
@@ -563,11 +563,11 @@
   <w:p>
     <w:pPr>
       <w:shd w:val="clear" w:color="auto" w:fill="0B2341"/>
-      <w:ind w:left="-1417" w:right="-1134"/>
-      <w:spacing w:before="100" w:after="100" w:line="240" w:lineRule="auto"/>
+      <w:ind w:left="-1440" w:right="-1260"/>
+      <w:spacing w:before="300" w:after="300" w:line="240" w:lineRule="auto"/>
       <w:tabs>
         <w:tab w:val="center" w:pos="4536"/>
-        <w:tab w:val="right" w:pos="10489"/>
+        <w:tab w:val="right" w:pos="10300"/>
       </w:tabs>
     </w:pPr>
     <w:r>
@@ -575,9 +575,9 @@
         <w:rFonts w:ascii="Arial" w:hAnsi="Arial"/>
         <w:b w:val="0"/>
         <w:color w:val="FFFFFF"/>
-        <w:sz w:val="16"/>
-      </w:rPr>
-      <w:t xml:space="preserve">  </w:t>
+        <w:sz w:val="18"/>
+      </w:rPr>
+      <w:t xml:space="preserve">   </w:t>
     </w:r>
     <w:r>
       <w:rPr>
@@ -635,15 +635,6 @@
       <w:fldChar w:fldCharType="separate"/>
       <w:t>0</w:t>
       <w:fldChar w:fldCharType="end"/>
-    </w:r>
-    <w:r>
-      <w:rPr>
-        <w:rFonts w:ascii="Arial" w:hAnsi="Arial"/>
-        <w:b w:val="0"/>
-        <w:color w:val="FFFFFF"/>
-        <w:sz w:val="16"/>
-      </w:rPr>
-      <w:t xml:space="preserve">  </w:t>
     </w:r>
   </w:p>
 </w:ftr>

</xml_diff>

<commit_message>
fix: rodape com 3 paragrafos navy + lineRule=exact para altura confiavel
</commit_message>
<xml_diff>
--- a/Modelos jus/AGRAVO_INSTRUMENTO.docx
+++ b/Modelos jus/AGRAVO_INSTRUMENTO.docx
@@ -550,7 +550,7 @@
       <w:headerReference w:type="default" r:id="rId9"/>
       <w:footerReference w:type="default" r:id="rId10"/>
       <w:pgSz w:w="11906" w:h="16838"/>
-      <w:pgMar w:top="1134" w:right="1134" w:bottom="1134" w:left="1417" w:header="283" w:footer="283" w:gutter="0"/>
+      <w:pgMar w:top="1134" w:right="1134" w:bottom="1134" w:left="1417" w:header="283" w:footer="0" w:gutter="0"/>
       <w:cols w:space="720"/>
       <w:docGrid w:linePitch="360"/>
     </w:sectPr>
@@ -564,7 +564,14 @@
     <w:pPr>
       <w:shd w:val="clear" w:color="auto" w:fill="0B2341"/>
       <w:ind w:left="-1440" w:right="-1260"/>
-      <w:spacing w:before="300" w:after="300" w:line="240" w:lineRule="auto"/>
+      <w:spacing w:before="0" w:after="0" w:line="380" w:lineRule="exact"/>
+    </w:pPr>
+  </w:p>
+  <w:p>
+    <w:pPr>
+      <w:shd w:val="clear" w:color="auto" w:fill="0B2341"/>
+      <w:ind w:left="-1440" w:right="-1260"/>
+      <w:spacing w:before="0" w:after="0" w:line="280" w:lineRule="exact"/>
       <w:tabs>
         <w:tab w:val="center" w:pos="4536"/>
         <w:tab w:val="right" w:pos="10300"/>
@@ -577,7 +584,7 @@
         <w:color w:val="FFFFFF"/>
         <w:sz w:val="18"/>
       </w:rPr>
-      <w:t xml:space="preserve">   </w:t>
+      <w:t xml:space="preserve">   </w:t>
     </w:r>
     <w:r>
       <w:rPr>
@@ -636,6 +643,13 @@
       <w:t>0</w:t>
       <w:fldChar w:fldCharType="end"/>
     </w:r>
+  </w:p>
+  <w:p>
+    <w:pPr>
+      <w:shd w:val="clear" w:color="auto" w:fill="0B2341"/>
+      <w:ind w:left="-1440" w:right="-1260"/>
+      <w:spacing w:before="0" w:after="0" w:line="380" w:lineRule="exact"/>
+    </w:pPr>
   </w:p>
 </w:ftr>
 </file>

</xml_diff>

<commit_message>
fix: rodape com wp:anchor flutuante — retangulo navy cobre borda a borda
</commit_message>
<xml_diff>
--- a/Modelos jus/AGRAVO_INSTRUMENTO.docx
+++ b/Modelos jus/AGRAVO_INSTRUMENTO.docx
@@ -560,18 +560,58 @@
 
 <file path=word/footer1.xml><?xml version="1.0" encoding="utf-8"?>
 <w:ftr xmlns:m="http://schemas.openxmlformats.org/officeDocument/2006/math" xmlns:mc="http://schemas.openxmlformats.org/markup-compatibility/2006" xmlns:mo="http://schemas.microsoft.com/office/mac/office/2008/main" xmlns:mv="urn:schemas-microsoft-com:mac:vml" xmlns:o="urn:schemas-microsoft-com:office:office" xmlns:r="http://schemas.openxmlformats.org/officeDocument/2006/relationships" xmlns:v="urn:schemas-microsoft-com:vml" xmlns:w10="urn:schemas-microsoft-com:office:word" xmlns:w14="http://schemas.microsoft.com/office/word/2010/wordml" xmlns:w="http://schemas.openxmlformats.org/wordprocessingml/2006/main" xmlns:wne="http://schemas.microsoft.com/office/word/2006/wordml" xmlns:wp14="http://schemas.microsoft.com/office/word/2010/wordprocessingDrawing" xmlns:wp="http://schemas.openxmlformats.org/drawingml/2006/wordprocessingDrawing" xmlns:wpc="http://schemas.microsoft.com/office/word/2010/wordprocessingCanvas" xmlns:wpg="http://schemas.microsoft.com/office/word/2010/wordprocessingGroup" xmlns:wpi="http://schemas.microsoft.com/office/word/2010/wordprocessingInk" xmlns:wps="http://schemas.microsoft.com/office/word/2010/wordprocessingShape" mc:Ignorable="w14 wp14">
-  <w:p>
-    <w:pPr>
-      <w:shd w:val="clear" w:color="auto" w:fill="0B2341"/>
-      <w:ind w:left="-1440" w:right="-1260"/>
-      <w:spacing w:before="0" w:after="0" w:line="380" w:lineRule="exact"/>
-    </w:pPr>
+  <w:p xmlns:a="http://schemas.openxmlformats.org/drawingml/2006/main">
+    <w:pPr>
+      <w:spacing w:before="0" w:after="0"/>
+    </w:pPr>
+    <w:r>
+      <w:drawing>
+        <wp:anchor distT="0" distB="0" distL="0" distR="0" simplePos="0" relativeHeight="251658240" behindDoc="1" locked="1" layoutInCell="1" allowOverlap="0">
+          <wp:simplePos x="0" y="0"/>
+          <wp:positionH relativeFrom="page">
+            <wp:posOffset>0</wp:posOffset>
+          </wp:positionH>
+          <wp:positionV relativeFrom="page">
+            <wp:posOffset>9972000</wp:posOffset>
+          </wp:positionV>
+          <wp:extent cx="7560000" cy="720000"/>
+          <wp:effectExtent l="0" t="0" r="0" b="0"/>
+          <wp:wrapNone/>
+          <wp:docPr id="20" name="FooterBar"/>
+          <wp:cNvGraphicFramePr/>
+          <a:graphic>
+            <a:graphicData uri="http://schemas.microsoft.com/office/word/2010/wordprocessingShape">
+              <wps:wsp>
+                <wps:cNvSpPr txBx="0">
+                  <a:spLocks noChangeArrowheads="1"/>
+                </wps:cNvSpPr>
+                <wps:spPr>
+                  <a:xfrm>
+                    <a:off x="0" y="0"/>
+                    <a:ext cx="7560000" cy="720000"/>
+                  </a:xfrm>
+                  <a:prstGeom prst="rect">
+                    <a:avLst/>
+                  </a:prstGeom>
+                  <a:solidFill>
+                    <a:srgbClr val="0B2341"/>
+                  </a:solidFill>
+                  <a:ln>
+                    <a:noFill/>
+                  </a:ln>
+                </wps:spPr>
+                <wps:bodyPr/>
+              </wps:wsp>
+            </a:graphicData>
+          </a:graphic>
+        </wp:anchor>
+      </w:drawing>
+    </w:r>
   </w:p>
   <w:p>
     <w:pPr>
-      <w:shd w:val="clear" w:color="auto" w:fill="0B2341"/>
       <w:ind w:left="-1440" w:right="-1260"/>
-      <w:spacing w:before="0" w:after="0" w:line="280" w:lineRule="exact"/>
+      <w:spacing w:before="500" w:after="0" w:line="240" w:lineRule="auto"/>
       <w:tabs>
         <w:tab w:val="center" w:pos="4536"/>
         <w:tab w:val="right" w:pos="10300"/>
@@ -643,13 +683,6 @@
       <w:t>0</w:t>
       <w:fldChar w:fldCharType="end"/>
     </w:r>
-  </w:p>
-  <w:p>
-    <w:pPr>
-      <w:shd w:val="clear" w:color="auto" w:fill="0B2341"/>
-      <w:ind w:left="-1440" w:right="-1260"/>
-      <w:spacing w:before="0" w:after="0" w:line="380" w:lineRule="exact"/>
-    </w:pPr>
   </w:p>
 </w:ftr>
 </file>

</xml_diff>

<commit_message>
fix: rodape como caixa de texto flutuante com fill navy — altura garantida
</commit_message>
<xml_diff>
--- a/Modelos jus/AGRAVO_INSTRUMENTO.docx
+++ b/Modelos jus/AGRAVO_INSTRUMENTO.docx
@@ -566,7 +566,7 @@
     </w:pPr>
     <w:r>
       <w:drawing>
-        <wp:anchor distT="0" distB="0" distL="0" distR="0" simplePos="0" relativeHeight="251658240" behindDoc="1" locked="1" layoutInCell="1" allowOverlap="0">
+        <wp:anchor distT="0" distB="0" distL="0" distR="0" simplePos="0" relativeHeight="251659264" behindDoc="0" locked="1" layoutInCell="1" allowOverlap="0">
           <wp:simplePos x="0" y="0"/>
           <wp:positionH relativeFrom="page">
             <wp:posOffset>0</wp:posOffset>
@@ -577,12 +577,12 @@
           <wp:extent cx="7560000" cy="720000"/>
           <wp:effectExtent l="0" t="0" r="0" b="0"/>
           <wp:wrapNone/>
-          <wp:docPr id="20" name="FooterBar"/>
+          <wp:docPr id="21" name="FooterBox"/>
           <wp:cNvGraphicFramePr/>
           <a:graphic>
             <a:graphicData uri="http://schemas.microsoft.com/office/word/2010/wordprocessingShape">
               <wps:wsp>
-                <wps:cNvSpPr txBx="0">
+                <wps:cNvSpPr txBx="1">
                   <a:spLocks noChangeArrowheads="1"/>
                 </wps:cNvSpPr>
                 <wps:spPr>
@@ -600,7 +600,89 @@
                     <a:noFill/>
                   </a:ln>
                 </wps:spPr>
-                <wps:bodyPr/>
+                <wps:txbx>
+                  <w:txbxContent>
+                    <w:p>
+                      <w:pPr>
+                        <w:spacing w:before="0" w:after="0" w:line="360" w:lineRule="auto"/>
+                        <w:jc w:val="left"/>
+                        <w:tabs>
+                          <w:tab w:val="center" w:pos="5881"/>
+                          <w:tab w:val="right" w:pos="11400"/>
+                        </w:tabs>
+                      </w:pPr>
+                      <w:r>
+                        <w:rPr>
+                          <w:rFonts w:ascii="Arial" w:hAnsi="Arial"/>
+                          <w:b/>
+                          <w:color w:val="FFFFFF"/>
+                          <w:sz w:val="20"/>
+                          <w:spacing w:val="50"/>
+                        </w:rPr>
+                        <w:t xml:space="preserve">AE</w:t>
+                      </w:r>
+                      <w:r>
+                        <w:rPr>
+                          <w:rFonts w:ascii="Arial" w:hAnsi="Arial"/>
+                          <w:color w:val="B69A54"/>
+                          <w:sz w:val="18"/>
+                        </w:rPr>
+                        <w:t xml:space="preserve">  |  </w:t>
+                      </w:r>
+                      <w:r>
+                        <w:rPr>
+                          <w:rFonts w:ascii="Arial" w:hAnsi="Arial"/>
+                          <w:color w:val="FFFFFF"/>
+                          <w:sz w:val="14"/>
+                          <w:spacing w:val="20"/>
+                        </w:rPr>
+                        <w:t>ANGELO EPIFANIO ADVOCACIA</w:t>
+                      </w:r>
+                      <w:r>
+                        <w:tab/>
+                      </w:r>
+                      <w:r>
+                        <w:rPr>
+                          <w:rFonts w:ascii="Arial" w:hAnsi="Arial"/>
+                          <w:color w:val="A0B9D2"/>
+                          <w:sz w:val="13"/>
+                        </w:rPr>
+                        <w:t>www.angeloepifanio.com.br  |  contato@angeloepifanio.com.br  |  Sao Jose dos Campos/SP</w:t>
+                      </w:r>
+                      <w:r>
+                        <w:tab/>
+                      </w:r>
+                      <w:r>
+                        <w:rPr>
+                          <w:rFonts w:ascii="Arial" w:hAnsi="Arial"/>
+                          <w:b/>
+                          <w:color w:val="FFFFFF"/>
+                          <w:sz w:val="18"/>
+                        </w:rPr>
+                        <w:fldChar w:fldCharType="begin"/>
+                      </w:r>
+                      <w:r>
+                        <w:rPr>
+                          <w:rFonts w:ascii="Arial" w:hAnsi="Arial"/>
+                          <w:b/>
+                          <w:color w:val="FFFFFF"/>
+                          <w:sz w:val="18"/>
+                        </w:rPr>
+                        <w:instrText xml:space="preserve"> PAGE </w:instrText>
+                      </w:r>
+                      <w:r>
+                        <w:rPr>
+                          <w:rFonts w:ascii="Arial" w:hAnsi="Arial"/>
+                          <w:b/>
+                          <w:color w:val="FFFFFF"/>
+                          <w:sz w:val="18"/>
+                        </w:rPr>
+                        <w:fldChar w:fldCharType="end"/>
+                      </w:r>
+                    </w:p>
+                  </w:txbxContent>
+                </wps:txbx>
+                <wps:bodyPr lIns="91440" tIns="0" rIns="91440" bIns="0" anchor="ctr" anchorCtr="0" wrap="square" vertOverflow="clip" horzOverflow="clip"/>
               </wps:wsp>
             </a:graphicData>
           </a:graphic>
@@ -610,79 +692,8 @@
   </w:p>
   <w:p>
     <w:pPr>
-      <w:ind w:left="-1440" w:right="-1260"/>
-      <w:spacing w:before="500" w:after="0" w:line="240" w:lineRule="auto"/>
-      <w:tabs>
-        <w:tab w:val="center" w:pos="4536"/>
-        <w:tab w:val="right" w:pos="10300"/>
-      </w:tabs>
-    </w:pPr>
-    <w:r>
-      <w:rPr>
-        <w:rFonts w:ascii="Arial" w:hAnsi="Arial"/>
-        <w:b w:val="0"/>
-        <w:color w:val="FFFFFF"/>
-        <w:sz w:val="18"/>
-      </w:rPr>
-      <w:t xml:space="preserve">   </w:t>
-    </w:r>
-    <w:r>
-      <w:rPr>
-        <w:rFonts w:ascii="Arial" w:hAnsi="Arial"/>
-        <w:b/>
-        <w:color w:val="FFFFFF"/>
-        <w:sz w:val="20"/>
-        <w:spacing w:val="50"/>
-      </w:rPr>
-      <w:t>AE</w:t>
-    </w:r>
-    <w:r>
-      <w:rPr>
-        <w:rFonts w:ascii="Arial" w:hAnsi="Arial"/>
-        <w:b w:val="0"/>
-        <w:color w:val="B69A54"/>
-        <w:sz w:val="18"/>
-      </w:rPr>
-      <w:t xml:space="preserve">  |  </w:t>
-    </w:r>
-    <w:r>
-      <w:rPr>
-        <w:rFonts w:ascii="Arial" w:hAnsi="Arial"/>
-        <w:b w:val="0"/>
-        <w:color w:val="FFFFFF"/>
-        <w:sz w:val="14"/>
-        <w:spacing w:val="20"/>
-      </w:rPr>
-      <w:t>ANGELO EPIFANIO ADVOCACIA</w:t>
-    </w:r>
-    <w:r>
-      <w:tab/>
-    </w:r>
-    <w:r>
-      <w:rPr>
-        <w:rFonts w:ascii="Arial" w:hAnsi="Arial"/>
-        <w:b w:val="0"/>
-        <w:color w:val="A0B9D2"/>
-        <w:sz w:val="13"/>
-      </w:rPr>
-      <w:t>www.angeloepifanio.com.br  |  contato@angeloepifanio.com.br  |  São José dos Campos/SP</w:t>
-    </w:r>
-    <w:r>
-      <w:tab/>
-    </w:r>
-    <w:r>
-      <w:rPr>
-        <w:rFonts w:ascii="Arial" w:hAnsi="Arial"/>
-        <w:b/>
-        <w:color w:val="FFFFFF"/>
-        <w:sz w:val="18"/>
-      </w:rPr>
-      <w:fldChar w:fldCharType="begin"/>
-      <w:instrText xml:space="preserve"> PAGE </w:instrText>
-      <w:fldChar w:fldCharType="separate"/>
-      <w:t>0</w:t>
-      <w:fldChar w:fldCharType="end"/>
-    </w:r>
+      <w:spacing w:before="0" w:after="0"/>
+    </w:pPr>
   </w:p>
 </w:ftr>
 </file>

</xml_diff>

<commit_message>
fix: rodape com tabela trHeight=exact — altura 2cm garantida pelo Word
</commit_message>
<xml_diff>
--- a/Modelos jus/AGRAVO_INSTRUMENTO.docx
+++ b/Modelos jus/AGRAVO_INSTRUMENTO.docx
@@ -560,141 +560,172 @@
 
 <file path=word/footer1.xml><?xml version="1.0" encoding="utf-8"?>
 <w:ftr xmlns:m="http://schemas.openxmlformats.org/officeDocument/2006/math" xmlns:mc="http://schemas.openxmlformats.org/markup-compatibility/2006" xmlns:mo="http://schemas.microsoft.com/office/mac/office/2008/main" xmlns:mv="urn:schemas-microsoft-com:mac:vml" xmlns:o="urn:schemas-microsoft-com:office:office" xmlns:r="http://schemas.openxmlformats.org/officeDocument/2006/relationships" xmlns:v="urn:schemas-microsoft-com:vml" xmlns:w10="urn:schemas-microsoft-com:office:word" xmlns:w14="http://schemas.microsoft.com/office/word/2010/wordml" xmlns:w="http://schemas.openxmlformats.org/wordprocessingml/2006/main" xmlns:wne="http://schemas.microsoft.com/office/word/2006/wordml" xmlns:wp14="http://schemas.microsoft.com/office/word/2010/wordprocessingDrawing" xmlns:wp="http://schemas.openxmlformats.org/drawingml/2006/wordprocessingDrawing" xmlns:wpc="http://schemas.microsoft.com/office/word/2010/wordprocessingCanvas" xmlns:wpg="http://schemas.microsoft.com/office/word/2010/wordprocessingGroup" xmlns:wpi="http://schemas.microsoft.com/office/word/2010/wordprocessingInk" xmlns:wps="http://schemas.microsoft.com/office/word/2010/wordprocessingShape" mc:Ignorable="w14 wp14">
-  <w:p xmlns:a="http://schemas.openxmlformats.org/drawingml/2006/main">
-    <w:pPr>
-      <w:spacing w:before="0" w:after="0"/>
-    </w:pPr>
-    <w:r>
-      <w:drawing>
-        <wp:anchor distT="0" distB="0" distL="0" distR="0" simplePos="0" relativeHeight="251659264" behindDoc="0" locked="1" layoutInCell="1" allowOverlap="0">
-          <wp:simplePos x="0" y="0"/>
-          <wp:positionH relativeFrom="page">
-            <wp:posOffset>0</wp:posOffset>
-          </wp:positionH>
-          <wp:positionV relativeFrom="page">
-            <wp:posOffset>9972000</wp:posOffset>
-          </wp:positionV>
-          <wp:extent cx="7560000" cy="720000"/>
-          <wp:effectExtent l="0" t="0" r="0" b="0"/>
-          <wp:wrapNone/>
-          <wp:docPr id="21" name="FooterBox"/>
-          <wp:cNvGraphicFramePr/>
-          <a:graphic>
-            <a:graphicData uri="http://schemas.microsoft.com/office/word/2010/wordprocessingShape">
-              <wps:wsp>
-                <wps:cNvSpPr txBx="1">
-                  <a:spLocks noChangeArrowheads="1"/>
-                </wps:cNvSpPr>
-                <wps:spPr>
-                  <a:xfrm>
-                    <a:off x="0" y="0"/>
-                    <a:ext cx="7560000" cy="720000"/>
-                  </a:xfrm>
-                  <a:prstGeom prst="rect">
-                    <a:avLst/>
-                  </a:prstGeom>
-                  <a:solidFill>
-                    <a:srgbClr val="0B2341"/>
-                  </a:solidFill>
-                  <a:ln>
-                    <a:noFill/>
-                  </a:ln>
-                </wps:spPr>
-                <wps:txbx>
-                  <w:txbxContent>
-                    <w:p>
-                      <w:pPr>
-                        <w:spacing w:before="0" w:after="0" w:line="360" w:lineRule="auto"/>
-                        <w:jc w:val="left"/>
-                        <w:tabs>
-                          <w:tab w:val="center" w:pos="5881"/>
-                          <w:tab w:val="right" w:pos="11400"/>
-                        </w:tabs>
-                      </w:pPr>
-                      <w:r>
-                        <w:rPr>
-                          <w:rFonts w:ascii="Arial" w:hAnsi="Arial"/>
-                          <w:b/>
-                          <w:color w:val="FFFFFF"/>
-                          <w:sz w:val="20"/>
-                          <w:spacing w:val="50"/>
-                        </w:rPr>
-                        <w:t xml:space="preserve">AE</w:t>
-                      </w:r>
-                      <w:r>
-                        <w:rPr>
-                          <w:rFonts w:ascii="Arial" w:hAnsi="Arial"/>
-                          <w:color w:val="B69A54"/>
-                          <w:sz w:val="18"/>
-                        </w:rPr>
-                        <w:t xml:space="preserve">  |  </w:t>
-                      </w:r>
-                      <w:r>
-                        <w:rPr>
-                          <w:rFonts w:ascii="Arial" w:hAnsi="Arial"/>
-                          <w:color w:val="FFFFFF"/>
-                          <w:sz w:val="14"/>
-                          <w:spacing w:val="20"/>
-                        </w:rPr>
-                        <w:t>ANGELO EPIFANIO ADVOCACIA</w:t>
-                      </w:r>
-                      <w:r>
-                        <w:tab/>
-                      </w:r>
-                      <w:r>
-                        <w:rPr>
-                          <w:rFonts w:ascii="Arial" w:hAnsi="Arial"/>
-                          <w:color w:val="A0B9D2"/>
-                          <w:sz w:val="13"/>
-                        </w:rPr>
-                        <w:t>www.angeloepifanio.com.br  |  contato@angeloepifanio.com.br  |  Sao Jose dos Campos/SP</w:t>
-                      </w:r>
-                      <w:r>
-                        <w:tab/>
-                      </w:r>
-                      <w:r>
-                        <w:rPr>
-                          <w:rFonts w:ascii="Arial" w:hAnsi="Arial"/>
-                          <w:b/>
-                          <w:color w:val="FFFFFF"/>
-                          <w:sz w:val="18"/>
-                        </w:rPr>
-                        <w:fldChar w:fldCharType="begin"/>
-                      </w:r>
-                      <w:r>
-                        <w:rPr>
-                          <w:rFonts w:ascii="Arial" w:hAnsi="Arial"/>
-                          <w:b/>
-                          <w:color w:val="FFFFFF"/>
-                          <w:sz w:val="18"/>
-                        </w:rPr>
-                        <w:instrText xml:space="preserve"> PAGE </w:instrText>
-                      </w:r>
-                      <w:r>
-                        <w:rPr>
-                          <w:rFonts w:ascii="Arial" w:hAnsi="Arial"/>
-                          <w:b/>
-                          <w:color w:val="FFFFFF"/>
-                          <w:sz w:val="18"/>
-                        </w:rPr>
-                        <w:fldChar w:fldCharType="end"/>
-                      </w:r>
-                    </w:p>
-                  </w:txbxContent>
-                </wps:txbx>
-                <wps:bodyPr lIns="91440" tIns="0" rIns="91440" bIns="0" anchor="ctr" anchorCtr="0" wrap="square" vertOverflow="clip" horzOverflow="clip"/>
-              </wps:wsp>
-            </a:graphicData>
-          </a:graphic>
-        </wp:anchor>
-      </w:drawing>
-    </w:r>
-  </w:p>
-  <w:p>
-    <w:pPr>
-      <w:spacing w:before="0" w:after="0"/>
-    </w:pPr>
-  </w:p>
+  <w:tbl>
+    <w:tblPr>
+      <w:tblLook w:firstColumn="1" w:firstRow="1" w:lastColumn="0" w:lastRow="0" w:noHBand="0" w:noVBand="1" w:val="04A0"/>
+      <w:tblBorders>
+        <w:top w:val="none" w:sz="0" w:color="auto"/>
+        <w:left w:val="none" w:sz="0" w:color="auto"/>
+        <w:bottom w:val="none" w:sz="0" w:color="auto"/>
+        <w:right w:val="none" w:sz="0" w:color="auto"/>
+        <w:insideH w:val="none" w:sz="0" w:color="auto"/>
+        <w:insideV w:val="none" w:sz="0" w:color="auto"/>
+      </w:tblBorders>
+      <w:tblW w:w="10772" w:type="dxa"/>
+      <w:tblInd w:w="-1417" w:type="dxa"/>
+      <w:tblLayout w:type="fixed"/>
+    </w:tblPr>
+    <w:tblGrid>
+      <w:gridCol w:w="1500"/>
+      <w:gridCol w:w="6200"/>
+      <w:gridCol w:w="3072"/>
+    </w:tblGrid>
+    <w:tr>
+      <w:trPr>
+        <w:trHeight w:val="1134" w:hRule="exact"/>
+      </w:trPr>
+      <w:tc>
+        <w:tcPr>
+          <w:shd w:val="clear" w:color="auto" w:fill="0B2341"/>
+          <w:tcBorders>
+            <w:top w:val="none" w:sz="0" w:color="auto"/>
+            <w:left w:val="none" w:sz="0" w:color="auto"/>
+            <w:bottom w:val="none" w:sz="0" w:color="auto"/>
+            <w:right w:val="none" w:sz="0" w:color="auto"/>
+            <w:insideH w:val="none" w:sz="0" w:color="auto"/>
+            <w:insideV w:val="none" w:sz="0" w:color="auto"/>
+          </w:tcBorders>
+          <w:vAlign w:val="center"/>
+          <w:tcW w:w="1500" w:type="dxa"/>
+          <w:tcMar>
+            <w:top w:w="110" w:type="dxa"/>
+            <w:left w:w="110" w:type="dxa"/>
+            <w:bottom w:w="110" w:type="dxa"/>
+            <w:right w:w="110" w:type="dxa"/>
+          </w:tcMar>
+        </w:tcPr>
+        <w:p>
+          <w:pPr>
+            <w:spacing w:before="0" w:after="0"/>
+            <w:jc w:val="center"/>
+          </w:pPr>
+          <w:r>
+            <w:rPr>
+              <w:rFonts w:ascii="Arial" w:hAnsi="Arial"/>
+              <w:b/>
+              <w:color w:val="FFFFFF"/>
+              <w:sz w:val="36"/>
+              <w:spacing w:val="80"/>
+            </w:rPr>
+            <w:t>AE</w:t>
+          </w:r>
+        </w:p>
+      </w:tc>
+      <w:tc>
+        <w:tcPr>
+          <w:shd w:val="clear" w:color="auto" w:fill="0B2341"/>
+          <w:tcBorders>
+            <w:top w:val="none" w:sz="0" w:color="auto"/>
+            <w:left w:val="none" w:sz="0" w:color="auto"/>
+            <w:bottom w:val="none" w:sz="0" w:color="auto"/>
+            <w:right w:val="none" w:sz="0" w:color="auto"/>
+            <w:insideH w:val="none" w:sz="0" w:color="auto"/>
+            <w:insideV w:val="none" w:sz="0" w:color="auto"/>
+          </w:tcBorders>
+          <w:vAlign w:val="center"/>
+          <w:tcW w:w="6200" w:type="dxa"/>
+          <w:tcMar>
+            <w:top w:w="110" w:type="dxa"/>
+            <w:left w:w="110" w:type="dxa"/>
+            <w:bottom w:w="110" w:type="dxa"/>
+            <w:right w:w="110" w:type="dxa"/>
+          </w:tcMar>
+        </w:tcPr>
+        <w:p>
+          <w:pPr>
+            <w:spacing w:before="0" w:after="0"/>
+            <w:jc w:val="center"/>
+          </w:pPr>
+          <w:r>
+            <w:rPr>
+              <w:rFonts w:ascii="Arial" w:hAnsi="Arial"/>
+              <w:b/>
+              <w:color w:val="FFFFFF"/>
+              <w:sz w:val="17"/>
+              <w:spacing w:val="20"/>
+            </w:rPr>
+            <w:t>ANGELO EPIFANIO ADVOCACIA</w:t>
+          </w:r>
+        </w:p>
+        <w:p>
+          <w:pPr>
+            <w:spacing w:before="0" w:after="0"/>
+            <w:jc w:val="center"/>
+          </w:pPr>
+          <w:r>
+            <w:rPr>
+              <w:rFonts w:ascii="Arial" w:hAnsi="Arial"/>
+              <w:b w:val="0"/>
+              <w:color w:val="A0B9D2"/>
+              <w:sz w:val="14"/>
+            </w:rPr>
+            <w:t>www.angeloepifanio.com.br</w:t>
+          </w:r>
+        </w:p>
+      </w:tc>
+      <w:tc>
+        <w:tcPr>
+          <w:shd w:val="clear" w:color="auto" w:fill="0B2341"/>
+          <w:tcBorders>
+            <w:top w:val="none" w:sz="0" w:color="auto"/>
+            <w:left w:val="none" w:sz="0" w:color="auto"/>
+            <w:bottom w:val="none" w:sz="0" w:color="auto"/>
+            <w:right w:val="none" w:sz="0" w:color="auto"/>
+            <w:insideH w:val="none" w:sz="0" w:color="auto"/>
+            <w:insideV w:val="none" w:sz="0" w:color="auto"/>
+          </w:tcBorders>
+          <w:vAlign w:val="center"/>
+          <w:tcW w:w="3072" w:type="dxa"/>
+          <w:tcMar>
+            <w:top w:w="110" w:type="dxa"/>
+            <w:left w:w="110" w:type="dxa"/>
+            <w:bottom w:w="110" w:type="dxa"/>
+            <w:right w:w="110" w:type="dxa"/>
+          </w:tcMar>
+        </w:tcPr>
+        <w:p>
+          <w:pPr>
+            <w:spacing w:before="0" w:after="0"/>
+            <w:jc w:val="right"/>
+          </w:pPr>
+          <w:r>
+            <w:rPr>
+              <w:rFonts w:ascii="Arial" w:hAnsi="Arial"/>
+              <w:b w:val="0"/>
+              <w:color w:val="A0B9D2"/>
+              <w:sz w:val="14"/>
+            </w:rPr>
+            <w:t>contato@angeloepifanio.com.br</w:t>
+          </w:r>
+        </w:p>
+        <w:p>
+          <w:pPr>
+            <w:spacing w:before="0" w:after="0"/>
+            <w:jc w:val="right"/>
+          </w:pPr>
+          <w:r>
+            <w:rPr>
+              <w:rFonts w:ascii="Arial" w:hAnsi="Arial"/>
+              <w:b w:val="0"/>
+              <w:color w:val="A0B9D2"/>
+              <w:sz w:val="14"/>
+            </w:rPr>
+            <w:t>São José dos Campos/SP</w:t>
+          </w:r>
+        </w:p>
+      </w:tc>
+    </w:tr>
+  </w:tbl>
 </w:ftr>
 </file>
 

</xml_diff>

<commit_message>
refactor: consolidar template base AE e arquivar modelos antigos
- Template base único: Modelos jus/AGRAVO_INSTRUMENTO.docx (estilos AE, rodapé navy)
- gerar_docx.py: estilos atualizados para AE Título 1/2/3, AE Corpo, AE Citação, AE Endereçamento, AE Ornamento
- gerar_docx.py: default template atualizado para AGRAVO_INSTRUMENTO.docx
- _backup/: 7 modelos antigos, scripts de experimento e arquivos de teste arquivados

Co-Authored-By: Claude Sonnet 4.6 <noreply@anthropic.com>
</commit_message>
<xml_diff>
--- a/Modelos jus/AGRAVO_INSTRUMENTO.docx
+++ b/Modelos jus/AGRAVO_INSTRUMENTO.docx
@@ -550,7 +550,7 @@
       <w:headerReference w:type="default" r:id="rId9"/>
       <w:footerReference w:type="default" r:id="rId10"/>
       <w:pgSz w:w="11906" w:h="16838"/>
-      <w:pgMar w:top="1134" w:right="1134" w:bottom="1134" w:left="1417" w:header="283" w:footer="0" w:gutter="0"/>
+      <w:pgMar w:top="1134" w:right="1134" w:bottom="1500" w:left="1417" w:header="283" w:footer="300" w:gutter="0"/>
       <w:cols w:space="720"/>
       <w:docGrid w:linePitch="360"/>
     </w:sectPr>
@@ -559,16 +559,13 @@
 </file>
 
 <file path=word/footer1.xml><?xml version="1.0" encoding="utf-8"?>
-<w:ftr xmlns:m="http://schemas.openxmlformats.org/officeDocument/2006/math" xmlns:mc="http://schemas.openxmlformats.org/markup-compatibility/2006" xmlns:mo="http://schemas.microsoft.com/office/mac/office/2008/main" xmlns:mv="urn:schemas-microsoft-com:mac:vml" xmlns:o="urn:schemas-microsoft-com:office:office" xmlns:r="http://schemas.openxmlformats.org/officeDocument/2006/relationships" xmlns:v="urn:schemas-microsoft-com:vml" xmlns:w10="urn:schemas-microsoft-com:office:word" xmlns:w14="http://schemas.microsoft.com/office/word/2010/wordml" xmlns:w="http://schemas.openxmlformats.org/wordprocessingml/2006/main" xmlns:wne="http://schemas.microsoft.com/office/word/2006/wordml" xmlns:wp14="http://schemas.microsoft.com/office/word/2010/wordprocessingDrawing" xmlns:wp="http://schemas.openxmlformats.org/drawingml/2006/wordprocessingDrawing" xmlns:wpc="http://schemas.microsoft.com/office/word/2010/wordprocessingCanvas" xmlns:wpg="http://schemas.microsoft.com/office/word/2010/wordprocessingGroup" xmlns:wpi="http://schemas.microsoft.com/office/word/2010/wordprocessingInk" xmlns:wps="http://schemas.microsoft.com/office/word/2010/wordprocessingShape" mc:Ignorable="w14 wp14">
+<w:ftr xmlns:m="http://schemas.openxmlformats.org/officeDocument/2006/math" xmlns:mc="http://schemas.openxmlformats.org/markup-compatibility/2006" xmlns:o="urn:schemas-microsoft-com:office:office" xmlns:r="http://schemas.openxmlformats.org/officeDocument/2006/relationships" xmlns:v="urn:schemas-microsoft-com:vml" xmlns:w10="urn:schemas-microsoft-com:office:word" xmlns:w14="http://schemas.microsoft.com/office/word/2010/wordml" xmlns:w="http://schemas.openxmlformats.org/wordprocessingml/2006/main" xmlns:wne="http://schemas.microsoft.com/office/word/2006/wordml" xmlns:wp14="http://schemas.microsoft.com/office/word/2010/wordprocessingDrawing" xmlns:wp="http://schemas.openxmlformats.org/drawingml/2006/wordprocessingDrawing" xmlns:wpc="http://schemas.microsoft.com/office/word/2010/wordprocessingCanvas" xmlns:wpg="http://schemas.microsoft.com/office/word/2010/wordprocessingGroup" xmlns:wpi="http://schemas.microsoft.com/office/word/2010/wordprocessingInk" xmlns:wps="http://schemas.microsoft.com/office/word/2010/wordprocessingShape" mc:Ignorable="w14 wp14">
   <w:p>
     <w:pPr>
       <w:shd w:val="clear" w:color="auto" w:fill="0B2341"/>
       <w:ind w:left="-1417" w:right="-1134"/>
       <w:spacing w:before="0" w:after="0" w:line="567" w:lineRule="exact"/>
-      <w:tabs>
-        <w:tab w:val="center" w:pos="4536"/>
-        <w:tab w:val="right" w:pos="10219"/>
-      </w:tabs>
+      <w:jc w:val="left"/>
     </w:pPr>
     <w:r>
       <w:rPr>
@@ -583,11 +580,10 @@
     <w:r>
       <w:rPr>
         <w:rFonts w:ascii="Arial" w:hAnsi="Arial"/>
-        <w:b w:val="0"/>
         <w:color w:val="FFFFFF"/>
         <w:sz w:val="14"/>
       </w:rPr>
-      <w:tab/>
+      <w:t xml:space="preserve">   </w:t>
     </w:r>
     <w:r>
       <w:rPr>
@@ -598,71 +594,6 @@
         <w:spacing w:val="15"/>
       </w:rPr>
       <w:t>ANGELO EPIFANIO ADVOCACIA</w:t>
-    </w:r>
-    <w:r>
-      <w:rPr>
-        <w:rFonts w:ascii="Arial" w:hAnsi="Arial"/>
-        <w:b w:val="0"/>
-        <w:color w:val="FFFFFF"/>
-        <w:sz w:val="14"/>
-      </w:rPr>
-      <w:tab/>
-    </w:r>
-    <w:r>
-      <w:rPr>
-        <w:rFonts w:ascii="Arial" w:hAnsi="Arial"/>
-        <w:b w:val="0"/>
-        <w:color w:val="A0B9D2"/>
-        <w:sz w:val="14"/>
-      </w:rPr>
-      <w:t xml:space="preserve">contato@angeloepifanio.com.br  </w:t>
-    </w:r>
-    <w:r>
-      <w:br/>
-    </w:r>
-    <w:r>
-      <w:rPr>
-        <w:rFonts w:ascii="Arial" w:hAnsi="Arial"/>
-        <w:b w:val="0"/>
-        <w:color w:val="FFFFFF"/>
-        <w:sz w:val="14"/>
-      </w:rPr>
-    </w:r>
-    <w:r>
-      <w:rPr>
-        <w:rFonts w:ascii="Arial" w:hAnsi="Arial"/>
-        <w:b w:val="0"/>
-        <w:color w:val="FFFFFF"/>
-        <w:sz w:val="14"/>
-      </w:rPr>
-      <w:tab/>
-    </w:r>
-    <w:r>
-      <w:rPr>
-        <w:rFonts w:ascii="Arial" w:hAnsi="Arial"/>
-        <w:b w:val="0"/>
-        <w:color w:val="A0B9D2"/>
-        <w:sz w:val="14"/>
-      </w:rPr>
-      <w:t>www.angeloepifanio.com.br</w:t>
-    </w:r>
-    <w:r>
-      <w:rPr>
-        <w:rFonts w:ascii="Arial" w:hAnsi="Arial"/>
-        <w:b w:val="0"/>
-        <w:color w:val="FFFFFF"/>
-        <w:sz w:val="14"/>
-      </w:rPr>
-      <w:tab/>
-    </w:r>
-    <w:r>
-      <w:rPr>
-        <w:rFonts w:ascii="Arial" w:hAnsi="Arial"/>
-        <w:b w:val="0"/>
-        <w:color w:val="A0B9D2"/>
-        <w:sz w:val="14"/>
-      </w:rPr>
-      <w:t xml:space="preserve">São José dos Campos/SP  </w:t>
     </w:r>
   </w:p>
 </w:ftr>

</xml_diff>